<commit_message>
Mise en ligne automatique du site
</commit_message>
<xml_diff>
--- a/dl/23c2ab94e25d/Trames-memoire-2A-Formation.docx
+++ b/dl/23c2ab94e25d/Trames-memoire-2A-Formation.docx
@@ -9113,7 +9113,7 @@
           <w:sz w:val="20"/>
           <w:szCs w:val="20"/>
         </w:rPr>
-        <w:t xml:space="preserve">Besoin d'un regard extérieur avant le dépôt ? Relecture de mémoire avec retour écrit et entretien : 2aformation.com, rubrique Étudiants. Le prix du pack est déduit si vous commandez dans les 3 mois.</w:t>
+        <w:t xml:space="preserve">Besoin d'un regard extérieur avant le dépôt ? Relecture de mémoire avec retour écrit et entretien : 2aformation.com, rubrique Étudiants. Nous commentons votre écrit, nous ne le rédigeons jamais à votre place.</w:t>
       </w:r>
     </w:p>
     <w:p>
@@ -9124,7 +9124,7 @@
           <w:sz w:val="16"/>
           <w:szCs w:val="16"/>
         </w:rPr>
-        <w:t xml:space="preserve">© 2A Formation, 2026. Document réservé à l'usage personnel de l'acheteur.</w:t>
+        <w:t xml:space="preserve">© 2A Formation, 2026. Document gratuit, réservé à un usage personnel.</w:t>
       </w:r>
     </w:p>
     <w:sectPr>

</xml_diff>